<commit_message>
Clarify tabletop launch kit and email signup
</commit_message>
<xml_diff>
--- a/public/downloads/launch-kit/Campaign-and-Email-Templates.docx
+++ b/public/downloads/launch-kit/Campaign-and-Email-Templates.docx
@@ -20,7 +20,7 @@
     </w:p>
     <w:p>
       <w:r>
-        <w:t>Use these editable drafts to turn a product plan into clear campaign copy. Replace bracketed fields with verified project details. The examples describe fictional projects. Keep only the sections that apply to your product and audience.</w:t>
+        <w:t>Part of the Tabletop Campaign Launch Kit. Adapt these drafts to your Kickstarter or Gamefound campaign. Replace bracketed fields with verified facts and the chosen platform. Examples are fictional; keep only sections that apply.</w:t>
       </w:r>
     </w:p>
     <w:p>
@@ -2205,7 +2205,7 @@
         <w:rPr>
           <w:b w:val="0"/>
         </w:rPr>
-        <w:t>[PROJECT] is scheduled to launch on Kickstarter on [DATE] at [TIME AND TIMEZONE].</w:t>
+        <w:t>[PROJECT] is scheduled to launch on [KICKSTARTER OR GAMEFOUND] on [DATE] at [TIME AND TIMEZONE].</w:t>
       </w:r>
     </w:p>
     <w:p>
@@ -2221,7 +2221,7 @@
         <w:rPr>
           <w:b w:val="0"/>
         </w:rPr>
-        <w:t>You can follow the project here: [KICKSTARTER PRELAUNCH LINK]. Kickstarter can notify you when it goes live.</w:t>
+        <w:t>You can follow the project here: [CHOSEN PLATFORM FOLLOW LINK]. Follow the project there for available launch notifications.</w:t>
       </w:r>
     </w:p>
     <w:p>
@@ -2370,7 +2370,7 @@
         <w:rPr>
           <w:b/>
         </w:rPr>
-        <w:t>Subject: [PROJECT] is live on Kickstarter</w:t>
+        <w:t>Subject: [PROJECT] is live on [PLATFORM]</w:t>
       </w:r>
     </w:p>
     <w:p>
@@ -2394,7 +2394,7 @@
         <w:rPr>
           <w:b w:val="0"/>
         </w:rPr>
-        <w:t>[PROJECT] is now live: [UNIQUE KICKSTARTER LINK].</w:t>
+        <w:t>[PROJECT] is now live: [UNIQUE PLATFORM CAMPAIGN LINK].</w:t>
       </w:r>
     </w:p>
     <w:p>
@@ -2647,7 +2647,7 @@
         <w:rPr>
           <w:b/>
         </w:rPr>
-        <w:t>Subject: [PROJECT] ends [DAY] at [TIME]</w:t>
+        <w:t>Subject: [PROJECT] is scheduled to end [DAY] at [TIME]</w:t>
       </w:r>
     </w:p>
     <w:p>
@@ -2671,7 +2671,7 @@
         <w:rPr>
           <w:b w:val="0"/>
         </w:rPr>
-        <w:t>The [PROJECT] Kickstarter campaign is scheduled to end on [DATE] at [TIME AND TIMEZONE].</w:t>
+        <w:t>The [PROJECT] campaign on [PLATFORM] is scheduled to end on [DATE] at [TIME AND TIMEZONE]. [IF APPLICABLE: The live countdown may extend under the enabled Gamefound Endgame settings.]</w:t>
       </w:r>
     </w:p>
     <w:p>
@@ -2711,7 +2711,7 @@
         <w:rPr>
           <w:b w:val="0"/>
         </w:rPr>
-        <w:t>Primary action: Review rewards. Check: Use the exact live deadline. Suppress known backers and people who opted out.</w:t>
+        <w:t>Primary action: Review rewards. Check: Check the live deadline and any Gamefound Endgame extension. Suppress known backers and people who opted out.</w:t>
       </w:r>
     </w:p>
     <w:p>
@@ -2748,7 +2748,7 @@
         <w:rPr>
           <w:b/>
         </w:rPr>
-        <w:t>Subject: [PROJECT] closes today at [TIME]</w:t>
+        <w:t>Subject: [PROJECT] reaches its scheduled close today</w:t>
       </w:r>
     </w:p>
     <w:p>
@@ -2772,7 +2772,7 @@
         <w:rPr>
           <w:b w:val="0"/>
         </w:rPr>
-        <w:t>[PROJECT] closes today, [DATE], at [TIME AND TIMEZONE].</w:t>
+        <w:t>[PROJECT] reaches its scheduled closing time today, [DATE], at [TIME AND TIMEZONE]. [IF APPLICABLE: The live countdown can extend under Gamefound Endgame. Check the campaign for its current status.]</w:t>
       </w:r>
     </w:p>
     <w:p>
@@ -2860,7 +2860,7 @@
         <w:rPr>
           <w:b w:val="0"/>
         </w:rPr>
-        <w:t>[PROJECT] has finished its Kickstarter campaign with a funded outcome. Thank you for helping make it possible.</w:t>
+        <w:t>[PROJECT] has finished its [PLATFORM] crowdfunding campaign with a funded outcome. Thank you for helping make it possible.</w:t>
       </w:r>
     </w:p>
     <w:p>
@@ -2939,7 +2939,7 @@
         </w:rPr>
         <w:t>Hi [FIRST NAME],</w:t>
         <w:br/>
-        <w:t>The [PROJECT] campaign ended without reaching its funding goal. Under Kickstarter funding rules, campaign pledges are not collected when the goal is not met.</w:t>
+        <w:t>The [PROJECT] campaign ended without reaching its funding goal. [FOR AN ALL OR NOTHING KICKSTARTER OR GAMEFOUND CROWDFUNDING CAMPAIGN: Campaign pledges are not collected when the goal is not met. Confirm the actual project type and terms before using this sentence.]</w:t>
         <w:br/>
         <w:t>Thank you for the time, feedback and support you gave the project. We are reviewing [SPECIFIC FEEDBACK OR COST ISSUE] before deciding on the next step.</w:t>
         <w:br/>
@@ -3101,7 +3101,7 @@
       <w:rPr>
         <w:sz w:val="16"/>
       </w:rPr>
-      <w:t xml:space="preserve">Guildframe  </w:t>
+      <w:t xml:space="preserve">Guildframe  |  Tabletop Campaign Launch Kit  |  </w:t>
     </w:r>
     <w:fldSimple w:instr="PAGE"/>
   </w:p>

</xml_diff>